<commit_message>
docs(posts): update use cases, screens and roadmap for uc-18
Co-Authored-By: Claude Opus 5.5 <noreply@anthropic.com>
</commit_message>
<xml_diff>
--- a/docs/use cases.docx
+++ b/docs/use cases.docx
@@ -2480,10 +2480,10 @@
         <w:rPr>
           <w:b/>
         </w:rPr>
-        <w:t>Description:</w:t>
-      </w:r>
-      <w:r>
-        <w:t xml:space="preserve"> The original author of a music recommendation permanently removes their post from a Community feed.</w:t>
+        <w:t xml:space="preserve">Description:</w:t>
+      </w:r>
+      <w:r>
+        <w:t xml:space="preserve"> The original author of a music recommendation permanently removes their post from a Community feed. A Community's Admins and its Owner can delete any post in that Community the same way — a member's, a fellow Admin's, the Owner's, or a former member's (docs/features/posts-delete.md).</w:t>
       </w:r>
     </w:p>
     <w:p>
@@ -2494,10 +2494,10 @@
         <w:rPr>
           <w:b/>
         </w:rPr>
-        <w:t>Pre-conditions:</w:t>
-      </w:r>
-      <w:r>
-        <w:t xml:space="preserve"> The user is logged in, viewing a Community feed, and their User ID matches the authorId of the target Post.</w:t>
+        <w:t xml:space="preserve">Pre-conditions:</w:t>
+      </w:r>
+      <w:r>
+        <w:t xml:space="preserve"> The user is logged in, viewing a Community feed, and either their User ID matches the authorId of the target Post or they are an Admin or the Owner of that Community.</w:t>
       </w:r>
     </w:p>
     <w:p>
@@ -2568,7 +2568,7 @@
         <w:pStyle w:val="ListBullet2"/>
       </w:pPr>
       <w:r>
-        <w:t>The system prompts the user with a destructive action warning: "Are you sure you want to delete this recommendation? This will also delete all ratings and comments associated with it."</w:t>
+        <w:t xml:space="preserve">The system prompts the user with a destructive action warning: "Are you sure you want to delete this recommendation? This will also delete all ratings and comments associated with it." An Admin deleting someone else's post is asked instead: "Delete [Author]'s recommendation? This will also delete all ratings and comments on it. [Author] won't be notified."</w:t>
       </w:r>
     </w:p>
     <w:p>
@@ -2603,10 +2603,10 @@
         <w:rPr>
           <w:b/>
         </w:rPr>
-        <w:t>Fail description (Alternative Scenario):</w:t>
-      </w:r>
-      <w:r>
-        <w:t xml:space="preserve"> The user's device loses network connectivity immediately after confirming the deletion. The backend request fails. The system catches the error, leaves the post visible in the feed, and displays a temporary error banner: "Could not delete post. Check your connection and try again."</w:t>
+        <w:t xml:space="preserve">Fail description (Alternative Scenario):</w:t>
+      </w:r>
+      <w:r>
+        <w:t xml:space="preserve"> The user's device loses network connectivity immediately after confirming the deletion. The backend request fails. The system catches the error, leaves the post visible in the feed, and displays a temporary error banner: "Could not delete post. Check your connection and try again." If someone else deleted the post first, it simply disappears with "This post was already deleted." A plain member can never delete another member's post: the server refuses it.</w:t>
       </w:r>
     </w:p>
     <w:p>

</xml_diff>